<commit_message>
added refs to ignore, added some drafts of paper, added pca analysis vibed sonnet
</commit_message>
<xml_diff>
--- a/drafts/paper_blueprint.docx
+++ b/drafts/paper_blueprint.docx
@@ -16,11 +16,6 @@
         <w:t>A Study of ASR Adaptation and Representation Dimensionality in Persian Whisper Models</w:t>
         <w:br/>
         <w:br/>
-      </w:r>
-      <w:r>
-        <w:rPr>
-          <w:rStyle w:val="StrongEmphasis"/>
-        </w:rPr>
         <w:t>outline:</w:t>
       </w:r>
     </w:p>
@@ -98,7 +93,6 @@
           <w:numId w:val="1"/>
         </w:numPr>
         <w:tabs>
-          <w:tab w:val="clear" w:pos="709"/>
           <w:tab w:val="left" w:pos="709" w:leader="none"/>
         </w:tabs>
         <w:bidi w:val="0"/>
@@ -120,7 +114,6 @@
           <w:numId w:val="1"/>
         </w:numPr>
         <w:tabs>
-          <w:tab w:val="clear" w:pos="709"/>
           <w:tab w:val="left" w:pos="709" w:leader="none"/>
         </w:tabs>
         <w:bidi w:val="0"/>
@@ -142,7 +135,6 @@
           <w:numId w:val="1"/>
         </w:numPr>
         <w:tabs>
-          <w:tab w:val="clear" w:pos="709"/>
           <w:tab w:val="left" w:pos="709" w:leader="none"/>
         </w:tabs>
         <w:bidi w:val="0"/>
@@ -208,7 +200,6 @@
           <w:numId w:val="1"/>
         </w:numPr>
         <w:tabs>
-          <w:tab w:val="clear" w:pos="709"/>
           <w:tab w:val="left" w:pos="709" w:leader="none"/>
         </w:tabs>
         <w:bidi w:val="0"/>
@@ -251,7 +242,6 @@
           <w:numId w:val="2"/>
         </w:numPr>
         <w:tabs>
-          <w:tab w:val="clear" w:pos="709"/>
           <w:tab w:val="left" w:pos="709" w:leader="none"/>
         </w:tabs>
         <w:bidi w:val="0"/>
@@ -273,7 +263,6 @@
           <w:numId w:val="2"/>
         </w:numPr>
         <w:tabs>
-          <w:tab w:val="clear" w:pos="709"/>
           <w:tab w:val="left" w:pos="709" w:leader="none"/>
         </w:tabs>
         <w:bidi w:val="0"/>
@@ -295,7 +284,6 @@
           <w:numId w:val="2"/>
         </w:numPr>
         <w:tabs>
-          <w:tab w:val="clear" w:pos="709"/>
           <w:tab w:val="left" w:pos="709" w:leader="none"/>
         </w:tabs>
         <w:bidi w:val="0"/>
@@ -317,7 +305,6 @@
           <w:numId w:val="2"/>
         </w:numPr>
         <w:tabs>
-          <w:tab w:val="clear" w:pos="709"/>
           <w:tab w:val="left" w:pos="709" w:leader="none"/>
         </w:tabs>
         <w:bidi w:val="0"/>
@@ -388,7 +375,6 @@
           <w:numId w:val="3"/>
         </w:numPr>
         <w:tabs>
-          <w:tab w:val="clear" w:pos="709"/>
           <w:tab w:val="left" w:pos="709" w:leader="none"/>
         </w:tabs>
         <w:bidi w:val="0"/>
@@ -410,7 +396,6 @@
           <w:numId w:val="3"/>
         </w:numPr>
         <w:tabs>
-          <w:tab w:val="clear" w:pos="709"/>
           <w:tab w:val="left" w:pos="709" w:leader="none"/>
         </w:tabs>
         <w:bidi w:val="0"/>
@@ -443,7 +428,6 @@
           <w:numId w:val="4"/>
         </w:numPr>
         <w:tabs>
-          <w:tab w:val="clear" w:pos="709"/>
           <w:tab w:val="left" w:pos="709" w:leader="none"/>
         </w:tabs>
         <w:bidi w:val="0"/>
@@ -465,7 +449,6 @@
           <w:numId w:val="4"/>
         </w:numPr>
         <w:tabs>
-          <w:tab w:val="clear" w:pos="709"/>
           <w:tab w:val="left" w:pos="709" w:leader="none"/>
         </w:tabs>
         <w:bidi w:val="0"/>
@@ -487,7 +470,6 @@
           <w:numId w:val="4"/>
         </w:numPr>
         <w:tabs>
-          <w:tab w:val="clear" w:pos="709"/>
           <w:tab w:val="left" w:pos="709" w:leader="none"/>
         </w:tabs>
         <w:bidi w:val="0"/>
@@ -520,7 +502,6 @@
           <w:numId w:val="5"/>
         </w:numPr>
         <w:tabs>
-          <w:tab w:val="clear" w:pos="709"/>
           <w:tab w:val="left" w:pos="709" w:leader="none"/>
         </w:tabs>
         <w:bidi w:val="0"/>
@@ -542,7 +523,6 @@
           <w:numId w:val="5"/>
         </w:numPr>
         <w:tabs>
-          <w:tab w:val="clear" w:pos="709"/>
           <w:tab w:val="left" w:pos="709" w:leader="none"/>
         </w:tabs>
         <w:bidi w:val="0"/>
@@ -564,7 +544,6 @@
           <w:numId w:val="5"/>
         </w:numPr>
         <w:tabs>
-          <w:tab w:val="clear" w:pos="709"/>
           <w:tab w:val="left" w:pos="709" w:leader="none"/>
         </w:tabs>
         <w:bidi w:val="0"/>
@@ -648,7 +627,6 @@
           <w:numId w:val="6"/>
         </w:numPr>
         <w:tabs>
-          <w:tab w:val="clear" w:pos="709"/>
           <w:tab w:val="left" w:pos="709" w:leader="none"/>
         </w:tabs>
         <w:bidi w:val="0"/>
@@ -670,7 +648,6 @@
           <w:numId w:val="6"/>
         </w:numPr>
         <w:tabs>
-          <w:tab w:val="clear" w:pos="709"/>
           <w:tab w:val="left" w:pos="709" w:leader="none"/>
         </w:tabs>
         <w:bidi w:val="0"/>
@@ -692,7 +669,6 @@
           <w:numId w:val="6"/>
         </w:numPr>
         <w:tabs>
-          <w:tab w:val="clear" w:pos="709"/>
           <w:tab w:val="left" w:pos="709" w:leader="none"/>
         </w:tabs>
         <w:bidi w:val="0"/>
@@ -714,7 +690,6 @@
           <w:numId w:val="6"/>
         </w:numPr>
         <w:tabs>
-          <w:tab w:val="clear" w:pos="709"/>
           <w:tab w:val="left" w:pos="709" w:leader="none"/>
         </w:tabs>
         <w:bidi w:val="0"/>
@@ -789,7 +764,6 @@
           <w:numId w:val="7"/>
         </w:numPr>
         <w:tabs>
-          <w:tab w:val="clear" w:pos="709"/>
           <w:tab w:val="left" w:pos="709" w:leader="none"/>
         </w:tabs>
         <w:bidi w:val="0"/>
@@ -811,7 +785,6 @@
           <w:numId w:val="7"/>
         </w:numPr>
         <w:tabs>
-          <w:tab w:val="clear" w:pos="709"/>
           <w:tab w:val="left" w:pos="709" w:leader="none"/>
         </w:tabs>
         <w:bidi w:val="0"/>
@@ -833,7 +806,6 @@
           <w:numId w:val="7"/>
         </w:numPr>
         <w:tabs>
-          <w:tab w:val="clear" w:pos="709"/>
           <w:tab w:val="left" w:pos="709" w:leader="none"/>
         </w:tabs>
         <w:bidi w:val="0"/>
@@ -877,7 +849,6 @@
           <w:numId w:val="8"/>
         </w:numPr>
         <w:tabs>
-          <w:tab w:val="clear" w:pos="709"/>
           <w:tab w:val="left" w:pos="709" w:leader="none"/>
         </w:tabs>
         <w:bidi w:val="0"/>
@@ -899,7 +870,6 @@
           <w:numId w:val="8"/>
         </w:numPr>
         <w:tabs>
-          <w:tab w:val="clear" w:pos="709"/>
           <w:tab w:val="left" w:pos="709" w:leader="none"/>
         </w:tabs>
         <w:bidi w:val="0"/>
@@ -921,7 +891,6 @@
           <w:numId w:val="8"/>
         </w:numPr>
         <w:tabs>
-          <w:tab w:val="clear" w:pos="709"/>
           <w:tab w:val="left" w:pos="709" w:leader="none"/>
         </w:tabs>
         <w:bidi w:val="0"/>
@@ -943,7 +912,6 @@
           <w:numId w:val="8"/>
         </w:numPr>
         <w:tabs>
-          <w:tab w:val="clear" w:pos="709"/>
           <w:tab w:val="left" w:pos="709" w:leader="none"/>
         </w:tabs>
         <w:bidi w:val="0"/>
@@ -1018,7 +986,6 @@
           <w:numId w:val="9"/>
         </w:numPr>
         <w:tabs>
-          <w:tab w:val="clear" w:pos="709"/>
           <w:tab w:val="left" w:pos="709" w:leader="none"/>
         </w:tabs>
         <w:bidi w:val="0"/>
@@ -1040,7 +1007,6 @@
           <w:numId w:val="9"/>
         </w:numPr>
         <w:tabs>
-          <w:tab w:val="clear" w:pos="709"/>
           <w:tab w:val="left" w:pos="709" w:leader="none"/>
         </w:tabs>
         <w:bidi w:val="0"/>
@@ -1128,7 +1094,6 @@
           <w:numId w:val="10"/>
         </w:numPr>
         <w:tabs>
-          <w:tab w:val="clear" w:pos="709"/>
           <w:tab w:val="left" w:pos="709" w:leader="none"/>
         </w:tabs>
         <w:bidi w:val="0"/>
@@ -1150,7 +1115,6 @@
           <w:numId w:val="10"/>
         </w:numPr>
         <w:tabs>
-          <w:tab w:val="clear" w:pos="709"/>
           <w:tab w:val="left" w:pos="709" w:leader="none"/>
         </w:tabs>
         <w:bidi w:val="0"/>
@@ -1172,7 +1136,6 @@
           <w:numId w:val="10"/>
         </w:numPr>
         <w:tabs>
-          <w:tab w:val="clear" w:pos="709"/>
           <w:tab w:val="left" w:pos="709" w:leader="none"/>
         </w:tabs>
         <w:bidi w:val="0"/>
@@ -1205,7 +1168,6 @@
           <w:numId w:val="11"/>
         </w:numPr>
         <w:tabs>
-          <w:tab w:val="clear" w:pos="709"/>
           <w:tab w:val="left" w:pos="709" w:leader="none"/>
         </w:tabs>
         <w:bidi w:val="0"/>
@@ -1227,7 +1189,6 @@
           <w:numId w:val="11"/>
         </w:numPr>
         <w:tabs>
-          <w:tab w:val="clear" w:pos="709"/>
           <w:tab w:val="left" w:pos="709" w:leader="none"/>
         </w:tabs>
         <w:bidi w:val="0"/>
@@ -1249,7 +1210,6 @@
           <w:numId w:val="11"/>
         </w:numPr>
         <w:tabs>
-          <w:tab w:val="clear" w:pos="709"/>
           <w:tab w:val="left" w:pos="709" w:leader="none"/>
         </w:tabs>
         <w:bidi w:val="0"/>
@@ -1282,7 +1242,6 @@
           <w:numId w:val="12"/>
         </w:numPr>
         <w:tabs>
-          <w:tab w:val="clear" w:pos="709"/>
           <w:tab w:val="left" w:pos="709" w:leader="none"/>
         </w:tabs>
         <w:bidi w:val="0"/>
@@ -1304,7 +1263,6 @@
           <w:numId w:val="12"/>
         </w:numPr>
         <w:tabs>
-          <w:tab w:val="clear" w:pos="709"/>
           <w:tab w:val="left" w:pos="709" w:leader="none"/>
         </w:tabs>
         <w:bidi w:val="0"/>
@@ -1326,7 +1284,6 @@
           <w:numId w:val="12"/>
         </w:numPr>
         <w:tabs>
-          <w:tab w:val="clear" w:pos="709"/>
           <w:tab w:val="left" w:pos="709" w:leader="none"/>
         </w:tabs>
         <w:bidi w:val="0"/>
@@ -1348,7 +1305,6 @@
           <w:numId w:val="12"/>
         </w:numPr>
         <w:tabs>
-          <w:tab w:val="clear" w:pos="709"/>
           <w:tab w:val="left" w:pos="709" w:leader="none"/>
         </w:tabs>
         <w:bidi w:val="0"/>
@@ -1416,7 +1372,6 @@
           <w:numId w:val="13"/>
         </w:numPr>
         <w:tabs>
-          <w:tab w:val="clear" w:pos="709"/>
           <w:tab w:val="left" w:pos="709" w:leader="none"/>
         </w:tabs>
         <w:bidi w:val="0"/>
@@ -1438,7 +1393,6 @@
           <w:numId w:val="13"/>
         </w:numPr>
         <w:tabs>
-          <w:tab w:val="clear" w:pos="709"/>
           <w:tab w:val="left" w:pos="709" w:leader="none"/>
         </w:tabs>
         <w:bidi w:val="0"/>
@@ -1537,7 +1491,6 @@
           <w:numId w:val="14"/>
         </w:numPr>
         <w:tabs>
-          <w:tab w:val="clear" w:pos="709"/>
           <w:tab w:val="left" w:pos="709" w:leader="none"/>
         </w:tabs>
         <w:bidi w:val="0"/>
@@ -1559,7 +1512,6 @@
           <w:numId w:val="14"/>
         </w:numPr>
         <w:tabs>
-          <w:tab w:val="clear" w:pos="709"/>
           <w:tab w:val="left" w:pos="709" w:leader="none"/>
         </w:tabs>
         <w:bidi w:val="0"/>
@@ -1581,7 +1533,6 @@
           <w:numId w:val="14"/>
         </w:numPr>
         <w:tabs>
-          <w:tab w:val="clear" w:pos="709"/>
           <w:tab w:val="left" w:pos="709" w:leader="none"/>
         </w:tabs>
         <w:bidi w:val="0"/>
@@ -1614,7 +1565,6 @@
           <w:numId w:val="15"/>
         </w:numPr>
         <w:tabs>
-          <w:tab w:val="clear" w:pos="709"/>
           <w:tab w:val="left" w:pos="709" w:leader="none"/>
         </w:tabs>
         <w:bidi w:val="0"/>
@@ -1636,7 +1586,6 @@
           <w:numId w:val="15"/>
         </w:numPr>
         <w:tabs>
-          <w:tab w:val="clear" w:pos="709"/>
           <w:tab w:val="left" w:pos="709" w:leader="none"/>
         </w:tabs>
         <w:bidi w:val="0"/>
@@ -1658,7 +1607,6 @@
           <w:numId w:val="15"/>
         </w:numPr>
         <w:tabs>
-          <w:tab w:val="clear" w:pos="709"/>
           <w:tab w:val="left" w:pos="709" w:leader="none"/>
         </w:tabs>
         <w:bidi w:val="0"/>
@@ -1691,7 +1639,6 @@
           <w:numId w:val="16"/>
         </w:numPr>
         <w:tabs>
-          <w:tab w:val="clear" w:pos="709"/>
           <w:tab w:val="left" w:pos="709" w:leader="none"/>
         </w:tabs>
         <w:bidi w:val="0"/>
@@ -1713,7 +1660,6 @@
           <w:numId w:val="16"/>
         </w:numPr>
         <w:tabs>
-          <w:tab w:val="clear" w:pos="709"/>
           <w:tab w:val="left" w:pos="709" w:leader="none"/>
         </w:tabs>
         <w:bidi w:val="0"/>
@@ -1735,7 +1681,6 @@
           <w:numId w:val="16"/>
         </w:numPr>
         <w:tabs>
-          <w:tab w:val="clear" w:pos="709"/>
           <w:tab w:val="left" w:pos="709" w:leader="none"/>
         </w:tabs>
         <w:bidi w:val="0"/>
@@ -1824,6 +1769,623 @@
       <w:r>
         <w:rPr/>
         <w:t>Plots: PCA varience retention</w:t>
+      </w:r>
+    </w:p>
+    <w:p>
+      <w:pPr>
+        <w:pStyle w:val="Normal"/>
+        <w:bidi w:val="0"/>
+        <w:jc w:val="left"/>
+        <w:rPr/>
+      </w:pPr>
+      <w:r>
+        <w:rPr/>
+      </w:r>
+    </w:p>
+    <w:p>
+      <w:pPr>
+        <w:pStyle w:val="Normal"/>
+        <w:bidi w:val="0"/>
+        <w:jc w:val="left"/>
+        <w:rPr>
+          <w:b/>
+          <w:b/>
+          <w:bCs/>
+          <w:u w:val="single"/>
+        </w:rPr>
+      </w:pPr>
+      <w:r>
+        <w:rPr>
+          <w:b/>
+          <w:bCs/>
+          <w:u w:val="single"/>
+        </w:rPr>
+        <w:t>Introduction</w:t>
+      </w:r>
+    </w:p>
+    <w:p>
+      <w:pPr>
+        <w:pStyle w:val="Normal"/>
+        <w:bidi w:val="0"/>
+        <w:jc w:val="left"/>
+        <w:rPr/>
+      </w:pPr>
+      <w:r>
+        <w:rPr/>
+        <w:t>(A Multimodal Approach for Persian Speech</w:t>
+      </w:r>
+    </w:p>
+    <w:p>
+      <w:pPr>
+        <w:pStyle w:val="Normal"/>
+        <w:bidi w:val="0"/>
+        <w:jc w:val="left"/>
+        <w:rPr/>
+      </w:pPr>
+      <w:r>
+        <w:rPr/>
+        <w:t>Emotion Recognition with Evolutionary Feature</w:t>
+      </w:r>
+    </w:p>
+    <w:p>
+      <w:pPr>
+        <w:pStyle w:val="Normal"/>
+        <w:bidi w:val="0"/>
+        <w:jc w:val="left"/>
+        <w:rPr/>
+      </w:pPr>
+      <w:r>
+        <w:rPr/>
+        <w:t>Selection)</w:t>
+        <w:br/>
+        <w:t>In recent years, emotion recognition from speech has</w:t>
+      </w:r>
+    </w:p>
+    <w:p>
+      <w:pPr>
+        <w:pStyle w:val="Normal"/>
+        <w:bidi w:val="0"/>
+        <w:jc w:val="left"/>
+        <w:rPr/>
+      </w:pPr>
+      <w:r>
+        <w:rPr/>
+        <w:t>become a challenging topic in the field of speech processing.</w:t>
+      </w:r>
+    </w:p>
+    <w:p>
+      <w:pPr>
+        <w:pStyle w:val="Normal"/>
+        <w:bidi w:val="0"/>
+        <w:jc w:val="left"/>
+        <w:rPr/>
+      </w:pPr>
+      <w:r>
+        <w:rPr/>
+        <w:t>Speech processing can be employed to extract valuable</w:t>
+      </w:r>
+    </w:p>
+    <w:p>
+      <w:pPr>
+        <w:pStyle w:val="Normal"/>
+        <w:bidi w:val="0"/>
+        <w:jc w:val="left"/>
+        <w:rPr/>
+      </w:pPr>
+      <w:r>
+        <w:rPr/>
+        <w:t>meanings, which significantly aids in improving emotion</w:t>
+      </w:r>
+    </w:p>
+    <w:p>
+      <w:pPr>
+        <w:pStyle w:val="Normal"/>
+        <w:bidi w:val="0"/>
+        <w:jc w:val="left"/>
+        <w:rPr/>
+      </w:pPr>
+      <w:r>
+        <w:rPr/>
+        <w:t>recognition systems [1, 2]. Additionally, this technology is</w:t>
+      </w:r>
+    </w:p>
+    <w:p>
+      <w:pPr>
+        <w:pStyle w:val="Normal"/>
+        <w:bidi w:val="0"/>
+        <w:jc w:val="left"/>
+        <w:rPr/>
+      </w:pPr>
+      <w:r>
+        <w:rPr/>
+        <w:t>highly effective for applications requiring natural human-</w:t>
+      </w:r>
+    </w:p>
+    <w:p>
+      <w:pPr>
+        <w:pStyle w:val="Normal"/>
+        <w:bidi w:val="0"/>
+        <w:jc w:val="left"/>
+        <w:rPr/>
+      </w:pPr>
+      <w:r>
+        <w:rPr/>
+        <w:t>machine interaction, such as voice assistants and educational</w:t>
+      </w:r>
+    </w:p>
+    <w:p>
+      <w:pPr>
+        <w:pStyle w:val="Normal"/>
+        <w:bidi w:val="0"/>
+        <w:jc w:val="left"/>
+        <w:rPr/>
+      </w:pPr>
+      <w:r>
+        <w:rPr/>
+        <w:t>programs. These systems can also be useful in identifying</w:t>
+      </w:r>
+    </w:p>
+    <w:p>
+      <w:pPr>
+        <w:pStyle w:val="Normal"/>
+        <w:bidi w:val="0"/>
+        <w:jc w:val="left"/>
+        <w:rPr/>
+      </w:pPr>
+      <w:r>
+        <w:rPr/>
+        <w:t>customer emotions in support call centers [3, 4] and serve as</w:t>
+      </w:r>
+    </w:p>
+    <w:p>
+      <w:pPr>
+        <w:pStyle w:val="Normal"/>
+        <w:bidi w:val="0"/>
+        <w:jc w:val="left"/>
+        <w:rPr/>
+      </w:pPr>
+      <w:r>
+        <w:rPr/>
+        <w:t>tools in the medical and psychological domains to detect</w:t>
+      </w:r>
+    </w:p>
+    <w:p>
+      <w:pPr>
+        <w:pStyle w:val="Normal"/>
+        <w:bidi w:val="0"/>
+        <w:jc w:val="left"/>
+        <w:rPr/>
+      </w:pPr>
+      <w:r>
+        <w:rPr/>
+        <w:t>certain diseases, such as heart conditions and cancers, as well</w:t>
+      </w:r>
+    </w:p>
+    <w:p>
+      <w:pPr>
+        <w:pStyle w:val="Normal"/>
+        <w:bidi w:val="0"/>
+        <w:jc w:val="left"/>
+        <w:rPr/>
+      </w:pPr>
+      <w:r>
+        <w:rPr/>
+        <w:t>as in recognizing emotions in physically disabled individuals.</w:t>
+      </w:r>
+    </w:p>
+    <w:p>
+      <w:pPr>
+        <w:pStyle w:val="Normal"/>
+        <w:bidi w:val="0"/>
+        <w:jc w:val="left"/>
+        <w:rPr/>
+      </w:pPr>
+      <w:r>
+        <w:rPr/>
+        <w:t>Over the years, advancements in speech processing and</w:t>
+      </w:r>
+    </w:p>
+    <w:p>
+      <w:pPr>
+        <w:pStyle w:val="Normal"/>
+        <w:bidi w:val="0"/>
+        <w:jc w:val="left"/>
+        <w:rPr/>
+      </w:pPr>
+      <w:r>
+        <w:rPr/>
+        <w:t>deep learning have significantly improved Speech Emotion</w:t>
+      </w:r>
+    </w:p>
+    <w:p>
+      <w:pPr>
+        <w:pStyle w:val="Normal"/>
+        <w:bidi w:val="0"/>
+        <w:jc w:val="left"/>
+        <w:rPr/>
+      </w:pPr>
+      <w:r>
+        <w:rPr/>
+        <w:t>Recognition (SER) performance. However, accurately</w:t>
+      </w:r>
+    </w:p>
+    <w:p>
+      <w:pPr>
+        <w:pStyle w:val="Normal"/>
+        <w:bidi w:val="0"/>
+        <w:jc w:val="left"/>
+        <w:rPr/>
+      </w:pPr>
+      <w:r>
+        <w:rPr/>
+        <w:t>recognizing emotions from speech remains a challenging task,</w:t>
+      </w:r>
+    </w:p>
+    <w:p>
+      <w:pPr>
+        <w:pStyle w:val="Normal"/>
+        <w:bidi w:val="0"/>
+        <w:jc w:val="left"/>
+        <w:rPr/>
+      </w:pPr>
+      <w:r>
+        <w:rPr/>
+        <w:t>particularly in low-resource languages like Persian, where</w:t>
+      </w:r>
+    </w:p>
+    <w:p>
+      <w:pPr>
+        <w:pStyle w:val="Normal"/>
+        <w:bidi w:val="0"/>
+        <w:jc w:val="left"/>
+        <w:rPr/>
+      </w:pPr>
+      <w:r>
+        <w:rPr/>
+        <w:t>limited labeled datasets, complex phonetic structures, and</w:t>
+      </w:r>
+    </w:p>
+    <w:p>
+      <w:pPr>
+        <w:pStyle w:val="Normal"/>
+        <w:bidi w:val="0"/>
+        <w:jc w:val="left"/>
+        <w:rPr/>
+      </w:pPr>
+      <w:r>
+        <w:rPr/>
+        <w:t>high linguistic variability introduce additional difficulties [9,</w:t>
+      </w:r>
+    </w:p>
+    <w:p>
+      <w:pPr>
+        <w:pStyle w:val="Normal"/>
+        <w:bidi w:val="0"/>
+        <w:jc w:val="left"/>
+        <w:rPr/>
+      </w:pPr>
+      <w:r>
+        <w:rPr/>
+        <w:t>10].</w:t>
+      </w:r>
+    </w:p>
+    <w:p>
+      <w:pPr>
+        <w:pStyle w:val="Normal"/>
+        <w:bidi w:val="0"/>
+        <w:jc w:val="left"/>
+        <w:rPr/>
+      </w:pPr>
+      <w:r>
+        <w:rPr/>
+        <w:t>Traditional acoustic-based SER models mainly rely on</w:t>
+      </w:r>
+    </w:p>
+    <w:p>
+      <w:pPr>
+        <w:pStyle w:val="Normal"/>
+        <w:bidi w:val="0"/>
+        <w:jc w:val="left"/>
+        <w:rPr/>
+      </w:pPr>
+      <w:r>
+        <w:rPr/>
+        <w:t>prosodic and spectral features, which may not fully capture</w:t>
+      </w:r>
+    </w:p>
+    <w:p>
+      <w:pPr>
+        <w:pStyle w:val="Normal"/>
+        <w:bidi w:val="0"/>
+        <w:jc w:val="left"/>
+        <w:rPr/>
+      </w:pPr>
+      <w:r>
+        <w:rPr/>
+        <w:t>emotional intent. Speech conveys emotions through intensity,</w:t>
+      </w:r>
+    </w:p>
+    <w:p>
+      <w:pPr>
+        <w:pStyle w:val="Normal"/>
+        <w:bidi w:val="0"/>
+        <w:jc w:val="left"/>
+        <w:rPr/>
+      </w:pPr>
+      <w:r>
+        <w:rPr/>
+        <w:t>temporal variations, voice quality, and spectral patterns, while</w:t>
+      </w:r>
+    </w:p>
+    <w:p>
+      <w:pPr>
+        <w:pStyle w:val="Normal"/>
+        <w:bidi w:val="0"/>
+        <w:jc w:val="left"/>
+        <w:rPr/>
+      </w:pPr>
+      <w:r>
+        <w:rPr/>
+        <w:t>semantic content also plays a crucial role. To improve</w:t>
+      </w:r>
+    </w:p>
+    <w:p>
+      <w:pPr>
+        <w:pStyle w:val="Normal"/>
+        <w:bidi w:val="0"/>
+        <w:jc w:val="left"/>
+        <w:rPr/>
+      </w:pPr>
+      <w:r>
+        <w:rPr/>
+        <w:t>accuracy, recent studies have explored multimodal</w:t>
+      </w:r>
+    </w:p>
+    <w:p>
+      <w:pPr>
+        <w:pStyle w:val="Normal"/>
+        <w:bidi w:val="0"/>
+        <w:jc w:val="left"/>
+        <w:rPr/>
+      </w:pPr>
+      <w:r>
+        <w:rPr/>
+        <w:t>approaches combining audio and text [1, 11, 12] .Text-based</w:t>
+      </w:r>
+    </w:p>
+    <w:p>
+      <w:pPr>
+        <w:pStyle w:val="Normal"/>
+        <w:bidi w:val="0"/>
+        <w:jc w:val="left"/>
+        <w:rPr/>
+      </w:pPr>
+      <w:r>
+        <w:rPr/>
+        <w:t>cues, extracted from spoken language transcription, provide</w:t>
+      </w:r>
+    </w:p>
+    <w:p>
+      <w:pPr>
+        <w:pStyle w:val="Normal"/>
+        <w:bidi w:val="0"/>
+        <w:jc w:val="left"/>
+        <w:rPr/>
+      </w:pPr>
+      <w:r>
+        <w:rPr/>
+        <w:t>additional semantic clarity, helping to distinguish ambiguous</w:t>
+      </w:r>
+    </w:p>
+    <w:p>
+      <w:pPr>
+        <w:pStyle w:val="Normal"/>
+        <w:bidi w:val="0"/>
+        <w:jc w:val="left"/>
+        <w:rPr/>
+      </w:pPr>
+      <w:r>
+        <w:rPr/>
+        <w:t>emotions [13, 14].</w:t>
+      </w:r>
+    </w:p>
+    <w:p>
+      <w:pPr>
+        <w:pStyle w:val="Normal"/>
+        <w:bidi w:val="0"/>
+        <w:jc w:val="left"/>
+        <w:rPr/>
+      </w:pPr>
+      <w:r>
+        <w:rPr/>
+      </w:r>
+    </w:p>
+    <w:p>
+      <w:pPr>
+        <w:pStyle w:val="Normal"/>
+        <w:bidi w:val="0"/>
+        <w:jc w:val="left"/>
+        <w:rPr>
+          <w:b/>
+          <w:b/>
+          <w:bCs/>
+          <w:u w:val="single"/>
+        </w:rPr>
+      </w:pPr>
+      <w:r>
+        <w:rPr>
+          <w:b/>
+          <w:bCs/>
+          <w:u w:val="single"/>
+        </w:rPr>
+        <w:t>ours</w:t>
+      </w:r>
+    </w:p>
+    <w:p>
+      <w:pPr>
+        <w:pStyle w:val="Normal"/>
+        <w:bidi w:val="0"/>
+        <w:jc w:val="left"/>
+        <w:rPr>
+          <w:b/>
+          <w:b/>
+          <w:bCs/>
+          <w:u w:val="single"/>
+        </w:rPr>
+      </w:pPr>
+      <w:r>
+        <w:rPr>
+          <w:b/>
+          <w:bCs/>
+          <w:u w:val="single"/>
+        </w:rPr>
+        <w:t>In recent studies, pre-trained models have been adapted for extracting features</w:t>
+      </w:r>
+    </w:p>
+    <w:p>
+      <w:pPr>
+        <w:pStyle w:val="Normal"/>
+        <w:bidi w:val="0"/>
+        <w:jc w:val="left"/>
+        <w:rPr>
+          <w:b/>
+          <w:b/>
+          <w:bCs/>
+          <w:u w:val="single"/>
+        </w:rPr>
+      </w:pPr>
+      <w:r>
+        <w:rPr>
+          <w:b/>
+          <w:bCs/>
+          <w:u w:val="single"/>
+        </w:rPr>
+        <w:t>as opposed to traditional features such as MFCC. These studies have achieved state-</w:t>
+      </w:r>
+    </w:p>
+    <w:p>
+      <w:pPr>
+        <w:pStyle w:val="Normal"/>
+        <w:bidi w:val="0"/>
+        <w:jc w:val="left"/>
+        <w:rPr>
+          <w:b/>
+          <w:b/>
+          <w:bCs/>
+          <w:u w:val="single"/>
+        </w:rPr>
+      </w:pPr>
+      <w:r>
+        <w:rPr>
+          <w:b/>
+          <w:bCs/>
+          <w:u w:val="single"/>
+        </w:rPr>
+        <w:t>of-the-art results by fine-tuning pre-trained models on an SER corpus. Some other</w:t>
+      </w:r>
+    </w:p>
+    <w:p>
+      <w:pPr>
+        <w:pStyle w:val="Normal"/>
+        <w:bidi w:val="0"/>
+        <w:jc w:val="left"/>
+        <w:rPr>
+          <w:b/>
+          <w:b/>
+          <w:bCs/>
+          <w:u w:val="single"/>
+        </w:rPr>
+      </w:pPr>
+      <w:r>
+        <w:rPr>
+          <w:b/>
+          <w:bCs/>
+          <w:u w:val="single"/>
+        </w:rPr>
+        <w:t>studies treat the pre-trained model as an upstream model for feature extraction by freezing all layers and building a downstream model for predicting emotions based on</w:t>
+      </w:r>
+    </w:p>
+    <w:p>
+      <w:pPr>
+        <w:pStyle w:val="Normal"/>
+        <w:bidi w:val="0"/>
+        <w:jc w:val="left"/>
+        <w:rPr>
+          <w:b/>
+          <w:b/>
+          <w:bCs/>
+          <w:u w:val="single"/>
+        </w:rPr>
+      </w:pPr>
+      <w:r>
+        <w:rPr>
+          <w:b/>
+          <w:bCs/>
+          <w:u w:val="single"/>
+        </w:rPr>
+        <w:t>the representations produced by the pre-trained model.</w:t>
+      </w:r>
+    </w:p>
+    <w:p>
+      <w:pPr>
+        <w:pStyle w:val="Normal"/>
+        <w:bidi w:val="0"/>
+        <w:jc w:val="left"/>
+        <w:rPr>
+          <w:b/>
+          <w:b/>
+          <w:bCs/>
+          <w:u w:val="single"/>
+        </w:rPr>
+      </w:pPr>
+      <w:r>
+        <w:rPr>
+          <w:b/>
+          <w:bCs/>
+          <w:u w:val="single"/>
+        </w:rPr>
+      </w:r>
+    </w:p>
+    <w:p>
+      <w:pPr>
+        <w:pStyle w:val="Normal"/>
+        <w:bidi w:val="0"/>
+        <w:jc w:val="left"/>
+        <w:rPr>
+          <w:b/>
+          <w:b/>
+          <w:bCs/>
+          <w:u w:val="single"/>
+        </w:rPr>
+      </w:pPr>
+      <w:r>
+        <w:rPr>
+          <w:b/>
+          <w:bCs/>
+          <w:u w:val="single"/>
+        </w:rPr>
+      </w:r>
+    </w:p>
+    <w:p>
+      <w:pPr>
+        <w:pStyle w:val="Normal"/>
+        <w:bidi w:val="0"/>
+        <w:jc w:val="left"/>
+        <w:rPr/>
+      </w:pPr>
+      <w:r>
+        <w:rPr/>
+      </w:r>
+    </w:p>
+    <w:p>
+      <w:pPr>
+        <w:pStyle w:val="Normal"/>
+        <w:bidi w:val="0"/>
+        <w:jc w:val="left"/>
+        <w:rPr/>
+      </w:pPr>
+      <w:r>
+        <w:rPr/>
       </w:r>
     </w:p>
     <w:sectPr>
@@ -1833,6 +2395,7 @@
       <w:pgNumType w:fmt="decimal"/>
       <w:formProt w:val="false"/>
       <w:textDirection w:val="lrTb"/>
+      <w:docGrid w:type="default" w:linePitch="100" w:charSpace="0"/>
     </w:sectPr>
   </w:body>
 </w:document>
@@ -4048,7 +4611,6 @@
     </w:lvl>
     <w:lvl w:ilvl="1">
       <w:start w:val="1"/>
-      <w:pStyle w:val="Heading2"/>
       <w:numFmt w:val="none"/>
       <w:suff w:val="nothing"/>
       <w:lvlText w:val=""/>
@@ -4062,7 +4624,6 @@
     </w:lvl>
     <w:lvl w:ilvl="2">
       <w:start w:val="1"/>
-      <w:pStyle w:val="Heading3"/>
       <w:numFmt w:val="none"/>
       <w:suff w:val="nothing"/>
       <w:lvlText w:val=""/>
@@ -4076,7 +4637,6 @@
     </w:lvl>
     <w:lvl w:ilvl="3">
       <w:start w:val="1"/>
-      <w:pStyle w:val="Heading4"/>
       <w:numFmt w:val="none"/>
       <w:suff w:val="nothing"/>
       <w:lvlText w:val=""/>
@@ -4222,7 +4782,6 @@
     </w:rPrDefault>
     <w:pPrDefault>
       <w:pPr>
-        <w:widowControl/>
         <w:suppressAutoHyphens w:val="true"/>
       </w:pPr>
     </w:pPrDefault>
@@ -4232,7 +4791,10 @@
     <w:qFormat/>
     <w:pPr>
       <w:widowControl/>
+      <w:suppressAutoHyphens w:val="true"/>
       <w:bidi w:val="0"/>
+      <w:spacing w:before="0" w:after="0"/>
+      <w:jc w:val="left"/>
     </w:pPr>
     <w:rPr>
       <w:rFonts w:ascii="Liberation Serif" w:hAnsi="Liberation Serif" w:eastAsia="Noto Serif CJK SC" w:cs="Lohit Devanagari"/>

</xml_diff>

<commit_message>
editted drafts also edited ploting pca analysis to plot pdf on scree
</commit_message>
<xml_diff>
--- a/drafts/paper_blueprint.docx
+++ b/drafts/paper_blueprint.docx
@@ -1157,7 +1157,15 @@
       </w:pPr>
       <w:r>
         <w:rPr/>
-        <w:t>4.2 Baselines</w:t>
+        <w:t>4.</w:t>
+      </w:r>
+      <w:r>
+        <w:rPr/>
+        <w:t>2</w:t>
+      </w:r>
+      <w:r>
+        <w:rPr/>
+        <w:t xml:space="preserve"> Training Details</w:t>
       </w:r>
     </w:p>
     <w:p>
@@ -1178,7 +1186,7 @@
       </w:pPr>
       <w:r>
         <w:rPr/>
-        <w:t xml:space="preserve">Whisper without fine-tuning </w:t>
+        <w:t xml:space="preserve">Optimizer </w:t>
       </w:r>
     </w:p>
     <w:p>
@@ -1199,7 +1207,7 @@
       </w:pPr>
       <w:r>
         <w:rPr/>
-        <w:t xml:space="preserve">Without PCA </w:t>
+        <w:t xml:space="preserve">Learning rate </w:t>
       </w:r>
     </w:p>
     <w:p>
@@ -1213,25 +1221,14 @@
           <w:tab w:val="left" w:pos="709" w:leader="none"/>
         </w:tabs>
         <w:bidi w:val="0"/>
-        <w:ind w:left="709" w:hanging="283"/>
-        <w:jc w:val="left"/>
-        <w:rPr/>
-      </w:pPr>
-      <w:r>
-        <w:rPr/>
-        <w:t xml:space="preserve">Maybe wav2vec baseline (if space allows) </w:t>
-      </w:r>
-    </w:p>
-    <w:p>
-      <w:pPr>
-        <w:pStyle w:val="Heading4"/>
-        <w:bidi w:val="0"/>
-        <w:jc w:val="left"/>
-        <w:rPr/>
-      </w:pPr>
-      <w:r>
-        <w:rPr/>
-        <w:t>4.3 Training Details</w:t>
+        <w:spacing w:before="0" w:after="0"/>
+        <w:ind w:left="709" w:hanging="283"/>
+        <w:jc w:val="left"/>
+        <w:rPr/>
+      </w:pPr>
+      <w:r>
+        <w:rPr/>
+        <w:t xml:space="preserve">Batch size </w:t>
       </w:r>
     </w:p>
     <w:p>
@@ -1239,70 +1236,7 @@
         <w:pStyle w:val="TextBody"/>
         <w:numPr>
           <w:ilvl w:val="0"/>
-          <w:numId w:val="12"/>
-        </w:numPr>
-        <w:tabs>
-          <w:tab w:val="left" w:pos="709" w:leader="none"/>
-        </w:tabs>
-        <w:bidi w:val="0"/>
-        <w:spacing w:before="0" w:after="0"/>
-        <w:ind w:left="709" w:hanging="283"/>
-        <w:jc w:val="left"/>
-        <w:rPr/>
-      </w:pPr>
-      <w:r>
-        <w:rPr/>
-        <w:t xml:space="preserve">Optimizer </w:t>
-      </w:r>
-    </w:p>
-    <w:p>
-      <w:pPr>
-        <w:pStyle w:val="TextBody"/>
-        <w:numPr>
-          <w:ilvl w:val="0"/>
-          <w:numId w:val="12"/>
-        </w:numPr>
-        <w:tabs>
-          <w:tab w:val="left" w:pos="709" w:leader="none"/>
-        </w:tabs>
-        <w:bidi w:val="0"/>
-        <w:spacing w:before="0" w:after="0"/>
-        <w:ind w:left="709" w:hanging="283"/>
-        <w:jc w:val="left"/>
-        <w:rPr/>
-      </w:pPr>
-      <w:r>
-        <w:rPr/>
-        <w:t xml:space="preserve">Learning rate </w:t>
-      </w:r>
-    </w:p>
-    <w:p>
-      <w:pPr>
-        <w:pStyle w:val="TextBody"/>
-        <w:numPr>
-          <w:ilvl w:val="0"/>
-          <w:numId w:val="12"/>
-        </w:numPr>
-        <w:tabs>
-          <w:tab w:val="left" w:pos="709" w:leader="none"/>
-        </w:tabs>
-        <w:bidi w:val="0"/>
-        <w:spacing w:before="0" w:after="0"/>
-        <w:ind w:left="709" w:hanging="283"/>
-        <w:jc w:val="left"/>
-        <w:rPr/>
-      </w:pPr>
-      <w:r>
-        <w:rPr/>
-        <w:t xml:space="preserve">Batch size </w:t>
-      </w:r>
-    </w:p>
-    <w:p>
-      <w:pPr>
-        <w:pStyle w:val="TextBody"/>
-        <w:numPr>
-          <w:ilvl w:val="0"/>
-          <w:numId w:val="12"/>
+          <w:numId w:val="11"/>
         </w:numPr>
         <w:tabs>
           <w:tab w:val="left" w:pos="709" w:leader="none"/>
@@ -1369,7 +1303,7 @@
         <w:pStyle w:val="TextBody"/>
         <w:numPr>
           <w:ilvl w:val="0"/>
-          <w:numId w:val="13"/>
+          <w:numId w:val="12"/>
         </w:numPr>
         <w:tabs>
           <w:tab w:val="left" w:pos="709" w:leader="none"/>
@@ -1383,6 +1317,104 @@
       <w:r>
         <w:rPr/>
         <w:t xml:space="preserve">Main results table </w:t>
+      </w:r>
+    </w:p>
+    <w:p>
+      <w:pPr>
+        <w:pStyle w:val="TextBody"/>
+        <w:numPr>
+          <w:ilvl w:val="0"/>
+          <w:numId w:val="12"/>
+        </w:numPr>
+        <w:tabs>
+          <w:tab w:val="left" w:pos="709" w:leader="none"/>
+        </w:tabs>
+        <w:bidi w:val="0"/>
+        <w:spacing w:before="0" w:after="0"/>
+        <w:ind w:left="709" w:hanging="283"/>
+        <w:jc w:val="left"/>
+        <w:rPr/>
+      </w:pPr>
+      <w:r>
+        <w:rPr/>
+        <w:t xml:space="preserve">Show improvement from: </w:t>
+      </w:r>
+    </w:p>
+    <w:p>
+      <w:pPr>
+        <w:pStyle w:val="TextBody"/>
+        <w:numPr>
+          <w:ilvl w:val="1"/>
+          <w:numId w:val="12"/>
+        </w:numPr>
+        <w:tabs>
+          <w:tab w:val="clear" w:pos="709"/>
+          <w:tab w:val="left" w:pos="1418" w:leader="none"/>
+        </w:tabs>
+        <w:bidi w:val="0"/>
+        <w:spacing w:before="0" w:after="0"/>
+        <w:ind w:left="1418" w:hanging="283"/>
+        <w:jc w:val="left"/>
+        <w:rPr/>
+      </w:pPr>
+      <w:r>
+        <w:rPr/>
+        <w:t xml:space="preserve">ASR fine-tuning </w:t>
+      </w:r>
+    </w:p>
+    <w:p>
+      <w:pPr>
+        <w:pStyle w:val="TextBody"/>
+        <w:numPr>
+          <w:ilvl w:val="1"/>
+          <w:numId w:val="12"/>
+        </w:numPr>
+        <w:tabs>
+          <w:tab w:val="clear" w:pos="709"/>
+          <w:tab w:val="left" w:pos="1418" w:leader="none"/>
+        </w:tabs>
+        <w:bidi w:val="0"/>
+        <w:spacing w:before="0" w:after="0"/>
+        <w:ind w:left="1418" w:hanging="283"/>
+        <w:jc w:val="left"/>
+        <w:rPr/>
+      </w:pPr>
+      <w:r>
+        <w:rPr/>
+        <w:t xml:space="preserve">PCA </w:t>
+      </w:r>
+    </w:p>
+    <w:p>
+      <w:pPr>
+        <w:pStyle w:val="TextBody"/>
+        <w:numPr>
+          <w:ilvl w:val="1"/>
+          <w:numId w:val="12"/>
+        </w:numPr>
+        <w:tabs>
+          <w:tab w:val="clear" w:pos="709"/>
+          <w:tab w:val="left" w:pos="1418" w:leader="none"/>
+        </w:tabs>
+        <w:bidi w:val="0"/>
+        <w:ind w:left="1418" w:hanging="283"/>
+        <w:jc w:val="left"/>
+        <w:rPr/>
+      </w:pPr>
+      <w:r>
+        <w:rPr/>
+        <w:t xml:space="preserve">Combined model </w:t>
+      </w:r>
+    </w:p>
+    <w:p>
+      <w:pPr>
+        <w:pStyle w:val="Heading4"/>
+        <w:bidi w:val="0"/>
+        <w:jc w:val="left"/>
+        <w:rPr/>
+      </w:pPr>
+      <w:r>
+        <w:rPr/>
+        <w:t>5.2 Ablation Study</w:t>
       </w:r>
     </w:p>
     <w:p>
@@ -1403,7 +1435,197 @@
       </w:pPr>
       <w:r>
         <w:rPr/>
-        <w:t xml:space="preserve">Show improvement from: </w:t>
+        <w:t xml:space="preserve">With vs without PCA </w:t>
+      </w:r>
+    </w:p>
+    <w:p>
+      <w:pPr>
+        <w:pStyle w:val="TextBody"/>
+        <w:numPr>
+          <w:ilvl w:val="0"/>
+          <w:numId w:val="13"/>
+        </w:numPr>
+        <w:tabs>
+          <w:tab w:val="left" w:pos="709" w:leader="none"/>
+        </w:tabs>
+        <w:bidi w:val="0"/>
+        <w:spacing w:before="0" w:after="0"/>
+        <w:ind w:left="709" w:hanging="283"/>
+        <w:jc w:val="left"/>
+        <w:rPr/>
+      </w:pPr>
+      <w:r>
+        <w:rPr/>
+        <w:t xml:space="preserve">Frozen vs fine-tuned Whisper </w:t>
+      </w:r>
+    </w:p>
+    <w:p>
+      <w:pPr>
+        <w:pStyle w:val="TextBody"/>
+        <w:numPr>
+          <w:ilvl w:val="0"/>
+          <w:numId w:val="13"/>
+        </w:numPr>
+        <w:tabs>
+          <w:tab w:val="left" w:pos="709" w:leader="none"/>
+        </w:tabs>
+        <w:bidi w:val="0"/>
+        <w:ind w:left="709" w:hanging="283"/>
+        <w:jc w:val="left"/>
+        <w:rPr/>
+      </w:pPr>
+      <w:r>
+        <w:rPr/>
+        <w:t xml:space="preserve">Different PCA dimensions </w:t>
+      </w:r>
+    </w:p>
+    <w:p>
+      <w:pPr>
+        <w:pStyle w:val="Heading4"/>
+        <w:bidi w:val="0"/>
+        <w:jc w:val="left"/>
+        <w:rPr/>
+      </w:pPr>
+      <w:r>
+        <w:rPr/>
+        <w:t>5.3 Discussion</w:t>
+      </w:r>
+    </w:p>
+    <w:p>
+      <w:pPr>
+        <w:pStyle w:val="TextBody"/>
+        <w:numPr>
+          <w:ilvl w:val="0"/>
+          <w:numId w:val="14"/>
+        </w:numPr>
+        <w:tabs>
+          <w:tab w:val="left" w:pos="709" w:leader="none"/>
+        </w:tabs>
+        <w:bidi w:val="0"/>
+        <w:spacing w:before="0" w:after="0"/>
+        <w:ind w:left="709" w:hanging="283"/>
+        <w:jc w:val="left"/>
+        <w:rPr/>
+      </w:pPr>
+      <w:r>
+        <w:rPr/>
+        <w:t xml:space="preserve">Why ASR fine-tuning helps emotion recognition </w:t>
+      </w:r>
+    </w:p>
+    <w:p>
+      <w:pPr>
+        <w:pStyle w:val="TextBody"/>
+        <w:numPr>
+          <w:ilvl w:val="0"/>
+          <w:numId w:val="14"/>
+        </w:numPr>
+        <w:tabs>
+          <w:tab w:val="left" w:pos="709" w:leader="none"/>
+        </w:tabs>
+        <w:bidi w:val="0"/>
+        <w:spacing w:before="0" w:after="0"/>
+        <w:ind w:left="709" w:hanging="283"/>
+        <w:jc w:val="left"/>
+        <w:rPr/>
+      </w:pPr>
+      <w:r>
+        <w:rPr/>
+        <w:t xml:space="preserve">Relation between linguistic clarity and emotional cues </w:t>
+      </w:r>
+    </w:p>
+    <w:p>
+      <w:pPr>
+        <w:pStyle w:val="TextBody"/>
+        <w:numPr>
+          <w:ilvl w:val="0"/>
+          <w:numId w:val="14"/>
+        </w:numPr>
+        <w:tabs>
+          <w:tab w:val="left" w:pos="709" w:leader="none"/>
+        </w:tabs>
+        <w:bidi w:val="0"/>
+        <w:ind w:left="709" w:hanging="283"/>
+        <w:jc w:val="left"/>
+        <w:rPr/>
+      </w:pPr>
+      <w:r>
+        <w:rPr/>
+        <w:t xml:space="preserve">Limitations </w:t>
+      </w:r>
+    </w:p>
+    <w:p>
+      <w:pPr>
+        <w:pStyle w:val="Heading3"/>
+        <w:bidi w:val="0"/>
+        <w:jc w:val="left"/>
+        <w:rPr/>
+      </w:pPr>
+      <w:r>
+        <w:rPr/>
+        <w:t>6. Conclusion (≈ 0.3 page)</w:t>
+      </w:r>
+    </w:p>
+    <w:p>
+      <w:pPr>
+        <w:pStyle w:val="TextBody"/>
+        <w:numPr>
+          <w:ilvl w:val="0"/>
+          <w:numId w:val="15"/>
+        </w:numPr>
+        <w:tabs>
+          <w:tab w:val="left" w:pos="709" w:leader="none"/>
+        </w:tabs>
+        <w:bidi w:val="0"/>
+        <w:spacing w:before="0" w:after="0"/>
+        <w:ind w:left="709" w:hanging="283"/>
+        <w:jc w:val="left"/>
+        <w:rPr/>
+      </w:pPr>
+      <w:r>
+        <w:rPr/>
+        <w:t xml:space="preserve">Summarize findings </w:t>
+      </w:r>
+    </w:p>
+    <w:p>
+      <w:pPr>
+        <w:pStyle w:val="TextBody"/>
+        <w:numPr>
+          <w:ilvl w:val="0"/>
+          <w:numId w:val="15"/>
+        </w:numPr>
+        <w:tabs>
+          <w:tab w:val="left" w:pos="709" w:leader="none"/>
+        </w:tabs>
+        <w:bidi w:val="0"/>
+        <w:spacing w:before="0" w:after="0"/>
+        <w:ind w:left="709" w:hanging="283"/>
+        <w:jc w:val="left"/>
+        <w:rPr/>
+      </w:pPr>
+      <w:r>
+        <w:rPr/>
+        <w:t xml:space="preserve">Emphasize Persian SER impact </w:t>
+      </w:r>
+    </w:p>
+    <w:p>
+      <w:pPr>
+        <w:pStyle w:val="TextBody"/>
+        <w:numPr>
+          <w:ilvl w:val="0"/>
+          <w:numId w:val="15"/>
+        </w:numPr>
+        <w:tabs>
+          <w:tab w:val="left" w:pos="709" w:leader="none"/>
+        </w:tabs>
+        <w:bidi w:val="0"/>
+        <w:spacing w:before="0" w:after="0"/>
+        <w:ind w:left="709" w:hanging="283"/>
+        <w:jc w:val="left"/>
+        <w:rPr/>
+      </w:pPr>
+      <w:r>
+        <w:rPr/>
+        <w:t xml:space="preserve">Future work: </w:t>
       </w:r>
     </w:p>
     <w:p>
@@ -1411,7 +1633,7 @@
         <w:pStyle w:val="TextBody"/>
         <w:numPr>
           <w:ilvl w:val="1"/>
-          <w:numId w:val="13"/>
+          <w:numId w:val="15"/>
         </w:numPr>
         <w:tabs>
           <w:tab w:val="clear" w:pos="709"/>
@@ -1425,7 +1647,7 @@
       </w:pPr>
       <w:r>
         <w:rPr/>
-        <w:t xml:space="preserve">ASR fine-tuning </w:t>
+        <w:t xml:space="preserve">Multilingual adaptation </w:t>
       </w:r>
     </w:p>
     <w:p>
@@ -1433,7 +1655,7 @@
         <w:pStyle w:val="TextBody"/>
         <w:numPr>
           <w:ilvl w:val="1"/>
-          <w:numId w:val="13"/>
+          <w:numId w:val="15"/>
         </w:numPr>
         <w:tabs>
           <w:tab w:val="clear" w:pos="709"/>
@@ -1447,7 +1669,7 @@
       </w:pPr>
       <w:r>
         <w:rPr/>
-        <w:t xml:space="preserve">PCA </w:t>
+        <w:t xml:space="preserve">Emotion-aware fine-tuning </w:t>
       </w:r>
     </w:p>
     <w:p>
@@ -1455,295 +1677,7 @@
         <w:pStyle w:val="TextBody"/>
         <w:numPr>
           <w:ilvl w:val="1"/>
-          <w:numId w:val="13"/>
-        </w:numPr>
-        <w:tabs>
-          <w:tab w:val="clear" w:pos="709"/>
-          <w:tab w:val="left" w:pos="1418" w:leader="none"/>
-        </w:tabs>
-        <w:bidi w:val="0"/>
-        <w:ind w:left="1418" w:hanging="283"/>
-        <w:jc w:val="left"/>
-        <w:rPr/>
-      </w:pPr>
-      <w:r>
-        <w:rPr/>
-        <w:t xml:space="preserve">Combined model </w:t>
-      </w:r>
-    </w:p>
-    <w:p>
-      <w:pPr>
-        <w:pStyle w:val="Heading4"/>
-        <w:bidi w:val="0"/>
-        <w:jc w:val="left"/>
-        <w:rPr/>
-      </w:pPr>
-      <w:r>
-        <w:rPr/>
-        <w:t>5.2 Ablation Study</w:t>
-      </w:r>
-    </w:p>
-    <w:p>
-      <w:pPr>
-        <w:pStyle w:val="TextBody"/>
-        <w:numPr>
-          <w:ilvl w:val="0"/>
-          <w:numId w:val="14"/>
-        </w:numPr>
-        <w:tabs>
-          <w:tab w:val="left" w:pos="709" w:leader="none"/>
-        </w:tabs>
-        <w:bidi w:val="0"/>
-        <w:spacing w:before="0" w:after="0"/>
-        <w:ind w:left="709" w:hanging="283"/>
-        <w:jc w:val="left"/>
-        <w:rPr/>
-      </w:pPr>
-      <w:r>
-        <w:rPr/>
-        <w:t xml:space="preserve">With vs without PCA </w:t>
-      </w:r>
-    </w:p>
-    <w:p>
-      <w:pPr>
-        <w:pStyle w:val="TextBody"/>
-        <w:numPr>
-          <w:ilvl w:val="0"/>
-          <w:numId w:val="14"/>
-        </w:numPr>
-        <w:tabs>
-          <w:tab w:val="left" w:pos="709" w:leader="none"/>
-        </w:tabs>
-        <w:bidi w:val="0"/>
-        <w:spacing w:before="0" w:after="0"/>
-        <w:ind w:left="709" w:hanging="283"/>
-        <w:jc w:val="left"/>
-        <w:rPr/>
-      </w:pPr>
-      <w:r>
-        <w:rPr/>
-        <w:t xml:space="preserve">Frozen vs fine-tuned Whisper </w:t>
-      </w:r>
-    </w:p>
-    <w:p>
-      <w:pPr>
-        <w:pStyle w:val="TextBody"/>
-        <w:numPr>
-          <w:ilvl w:val="0"/>
-          <w:numId w:val="14"/>
-        </w:numPr>
-        <w:tabs>
-          <w:tab w:val="left" w:pos="709" w:leader="none"/>
-        </w:tabs>
-        <w:bidi w:val="0"/>
-        <w:ind w:left="709" w:hanging="283"/>
-        <w:jc w:val="left"/>
-        <w:rPr/>
-      </w:pPr>
-      <w:r>
-        <w:rPr/>
-        <w:t xml:space="preserve">Different PCA dimensions </w:t>
-      </w:r>
-    </w:p>
-    <w:p>
-      <w:pPr>
-        <w:pStyle w:val="Heading4"/>
-        <w:bidi w:val="0"/>
-        <w:jc w:val="left"/>
-        <w:rPr/>
-      </w:pPr>
-      <w:r>
-        <w:rPr/>
-        <w:t>5.3 Discussion</w:t>
-      </w:r>
-    </w:p>
-    <w:p>
-      <w:pPr>
-        <w:pStyle w:val="TextBody"/>
-        <w:numPr>
-          <w:ilvl w:val="0"/>
           <w:numId w:val="15"/>
-        </w:numPr>
-        <w:tabs>
-          <w:tab w:val="left" w:pos="709" w:leader="none"/>
-        </w:tabs>
-        <w:bidi w:val="0"/>
-        <w:spacing w:before="0" w:after="0"/>
-        <w:ind w:left="709" w:hanging="283"/>
-        <w:jc w:val="left"/>
-        <w:rPr/>
-      </w:pPr>
-      <w:r>
-        <w:rPr/>
-        <w:t xml:space="preserve">Why ASR fine-tuning helps emotion recognition </w:t>
-      </w:r>
-    </w:p>
-    <w:p>
-      <w:pPr>
-        <w:pStyle w:val="TextBody"/>
-        <w:numPr>
-          <w:ilvl w:val="0"/>
-          <w:numId w:val="15"/>
-        </w:numPr>
-        <w:tabs>
-          <w:tab w:val="left" w:pos="709" w:leader="none"/>
-        </w:tabs>
-        <w:bidi w:val="0"/>
-        <w:spacing w:before="0" w:after="0"/>
-        <w:ind w:left="709" w:hanging="283"/>
-        <w:jc w:val="left"/>
-        <w:rPr/>
-      </w:pPr>
-      <w:r>
-        <w:rPr/>
-        <w:t xml:space="preserve">Relation between linguistic clarity and emotional cues </w:t>
-      </w:r>
-    </w:p>
-    <w:p>
-      <w:pPr>
-        <w:pStyle w:val="TextBody"/>
-        <w:numPr>
-          <w:ilvl w:val="0"/>
-          <w:numId w:val="15"/>
-        </w:numPr>
-        <w:tabs>
-          <w:tab w:val="left" w:pos="709" w:leader="none"/>
-        </w:tabs>
-        <w:bidi w:val="0"/>
-        <w:ind w:left="709" w:hanging="283"/>
-        <w:jc w:val="left"/>
-        <w:rPr/>
-      </w:pPr>
-      <w:r>
-        <w:rPr/>
-        <w:t xml:space="preserve">Limitations </w:t>
-      </w:r>
-    </w:p>
-    <w:p>
-      <w:pPr>
-        <w:pStyle w:val="Heading3"/>
-        <w:bidi w:val="0"/>
-        <w:jc w:val="left"/>
-        <w:rPr/>
-      </w:pPr>
-      <w:r>
-        <w:rPr/>
-        <w:t>6. Conclusion (≈ 0.3 page)</w:t>
-      </w:r>
-    </w:p>
-    <w:p>
-      <w:pPr>
-        <w:pStyle w:val="TextBody"/>
-        <w:numPr>
-          <w:ilvl w:val="0"/>
-          <w:numId w:val="16"/>
-        </w:numPr>
-        <w:tabs>
-          <w:tab w:val="left" w:pos="709" w:leader="none"/>
-        </w:tabs>
-        <w:bidi w:val="0"/>
-        <w:spacing w:before="0" w:after="0"/>
-        <w:ind w:left="709" w:hanging="283"/>
-        <w:jc w:val="left"/>
-        <w:rPr/>
-      </w:pPr>
-      <w:r>
-        <w:rPr/>
-        <w:t xml:space="preserve">Summarize findings </w:t>
-      </w:r>
-    </w:p>
-    <w:p>
-      <w:pPr>
-        <w:pStyle w:val="TextBody"/>
-        <w:numPr>
-          <w:ilvl w:val="0"/>
-          <w:numId w:val="16"/>
-        </w:numPr>
-        <w:tabs>
-          <w:tab w:val="left" w:pos="709" w:leader="none"/>
-        </w:tabs>
-        <w:bidi w:val="0"/>
-        <w:spacing w:before="0" w:after="0"/>
-        <w:ind w:left="709" w:hanging="283"/>
-        <w:jc w:val="left"/>
-        <w:rPr/>
-      </w:pPr>
-      <w:r>
-        <w:rPr/>
-        <w:t xml:space="preserve">Emphasize Persian SER impact </w:t>
-      </w:r>
-    </w:p>
-    <w:p>
-      <w:pPr>
-        <w:pStyle w:val="TextBody"/>
-        <w:numPr>
-          <w:ilvl w:val="0"/>
-          <w:numId w:val="16"/>
-        </w:numPr>
-        <w:tabs>
-          <w:tab w:val="left" w:pos="709" w:leader="none"/>
-        </w:tabs>
-        <w:bidi w:val="0"/>
-        <w:spacing w:before="0" w:after="0"/>
-        <w:ind w:left="709" w:hanging="283"/>
-        <w:jc w:val="left"/>
-        <w:rPr/>
-      </w:pPr>
-      <w:r>
-        <w:rPr/>
-        <w:t xml:space="preserve">Future work: </w:t>
-      </w:r>
-    </w:p>
-    <w:p>
-      <w:pPr>
-        <w:pStyle w:val="TextBody"/>
-        <w:numPr>
-          <w:ilvl w:val="1"/>
-          <w:numId w:val="16"/>
-        </w:numPr>
-        <w:tabs>
-          <w:tab w:val="clear" w:pos="709"/>
-          <w:tab w:val="left" w:pos="1418" w:leader="none"/>
-        </w:tabs>
-        <w:bidi w:val="0"/>
-        <w:spacing w:before="0" w:after="0"/>
-        <w:ind w:left="1418" w:hanging="283"/>
-        <w:jc w:val="left"/>
-        <w:rPr/>
-      </w:pPr>
-      <w:r>
-        <w:rPr/>
-        <w:t xml:space="preserve">Multilingual adaptation </w:t>
-      </w:r>
-    </w:p>
-    <w:p>
-      <w:pPr>
-        <w:pStyle w:val="TextBody"/>
-        <w:numPr>
-          <w:ilvl w:val="1"/>
-          <w:numId w:val="16"/>
-        </w:numPr>
-        <w:tabs>
-          <w:tab w:val="clear" w:pos="709"/>
-          <w:tab w:val="left" w:pos="1418" w:leader="none"/>
-        </w:tabs>
-        <w:bidi w:val="0"/>
-        <w:spacing w:before="0" w:after="0"/>
-        <w:ind w:left="1418" w:hanging="283"/>
-        <w:jc w:val="left"/>
-        <w:rPr/>
-      </w:pPr>
-      <w:r>
-        <w:rPr/>
-        <w:t xml:space="preserve">Emotion-aware fine-tuning </w:t>
-      </w:r>
-    </w:p>
-    <w:p>
-      <w:pPr>
-        <w:pStyle w:val="TextBody"/>
-        <w:numPr>
-          <w:ilvl w:val="1"/>
-          <w:numId w:val="16"/>
         </w:numPr>
         <w:tabs>
           <w:tab w:val="clear" w:pos="709"/>
@@ -4459,143 +4393,6 @@
     </w:lvl>
   </w:abstractNum>
   <w:abstractNum w:abstractNumId="16">
-    <w:lvl w:ilvl="0">
-      <w:start w:val="1"/>
-      <w:numFmt w:val="bullet"/>
-      <w:lvlText w:val=""/>
-      <w:lvlJc w:val="left"/>
-      <w:pPr>
-        <w:tabs>
-          <w:tab w:val="num" w:pos="709"/>
-        </w:tabs>
-        <w:ind w:left="709" w:hanging="283"/>
-      </w:pPr>
-      <w:rPr>
-        <w:rFonts w:ascii="Symbol" w:hAnsi="Symbol" w:cs="Symbol" w:hint="default"/>
-      </w:rPr>
-    </w:lvl>
-    <w:lvl w:ilvl="1">
-      <w:start w:val="1"/>
-      <w:numFmt w:val="bullet"/>
-      <w:lvlText w:val=""/>
-      <w:lvlJc w:val="left"/>
-      <w:pPr>
-        <w:tabs>
-          <w:tab w:val="num" w:pos="1418"/>
-        </w:tabs>
-        <w:ind w:left="1418" w:hanging="283"/>
-      </w:pPr>
-      <w:rPr>
-        <w:rFonts w:ascii="Symbol" w:hAnsi="Symbol" w:cs="Symbol" w:hint="default"/>
-      </w:rPr>
-    </w:lvl>
-    <w:lvl w:ilvl="2">
-      <w:start w:val="1"/>
-      <w:numFmt w:val="bullet"/>
-      <w:lvlText w:val=""/>
-      <w:lvlJc w:val="left"/>
-      <w:pPr>
-        <w:tabs>
-          <w:tab w:val="num" w:pos="2127"/>
-        </w:tabs>
-        <w:ind w:left="2127" w:hanging="283"/>
-      </w:pPr>
-      <w:rPr>
-        <w:rFonts w:ascii="Symbol" w:hAnsi="Symbol" w:cs="Symbol" w:hint="default"/>
-      </w:rPr>
-    </w:lvl>
-    <w:lvl w:ilvl="3">
-      <w:start w:val="1"/>
-      <w:numFmt w:val="bullet"/>
-      <w:lvlText w:val=""/>
-      <w:lvlJc w:val="left"/>
-      <w:pPr>
-        <w:tabs>
-          <w:tab w:val="num" w:pos="2836"/>
-        </w:tabs>
-        <w:ind w:left="2836" w:hanging="283"/>
-      </w:pPr>
-      <w:rPr>
-        <w:rFonts w:ascii="Symbol" w:hAnsi="Symbol" w:cs="Symbol" w:hint="default"/>
-      </w:rPr>
-    </w:lvl>
-    <w:lvl w:ilvl="4">
-      <w:start w:val="1"/>
-      <w:numFmt w:val="bullet"/>
-      <w:lvlText w:val=""/>
-      <w:lvlJc w:val="left"/>
-      <w:pPr>
-        <w:tabs>
-          <w:tab w:val="num" w:pos="3545"/>
-        </w:tabs>
-        <w:ind w:left="3545" w:hanging="283"/>
-      </w:pPr>
-      <w:rPr>
-        <w:rFonts w:ascii="Symbol" w:hAnsi="Symbol" w:cs="Symbol" w:hint="default"/>
-      </w:rPr>
-    </w:lvl>
-    <w:lvl w:ilvl="5">
-      <w:start w:val="1"/>
-      <w:numFmt w:val="bullet"/>
-      <w:lvlText w:val=""/>
-      <w:lvlJc w:val="left"/>
-      <w:pPr>
-        <w:tabs>
-          <w:tab w:val="num" w:pos="4254"/>
-        </w:tabs>
-        <w:ind w:left="4254" w:hanging="283"/>
-      </w:pPr>
-      <w:rPr>
-        <w:rFonts w:ascii="Symbol" w:hAnsi="Symbol" w:cs="Symbol" w:hint="default"/>
-      </w:rPr>
-    </w:lvl>
-    <w:lvl w:ilvl="6">
-      <w:start w:val="1"/>
-      <w:numFmt w:val="bullet"/>
-      <w:lvlText w:val=""/>
-      <w:lvlJc w:val="left"/>
-      <w:pPr>
-        <w:tabs>
-          <w:tab w:val="num" w:pos="4963"/>
-        </w:tabs>
-        <w:ind w:left="4963" w:hanging="283"/>
-      </w:pPr>
-      <w:rPr>
-        <w:rFonts w:ascii="Symbol" w:hAnsi="Symbol" w:cs="Symbol" w:hint="default"/>
-      </w:rPr>
-    </w:lvl>
-    <w:lvl w:ilvl="7">
-      <w:start w:val="1"/>
-      <w:numFmt w:val="bullet"/>
-      <w:lvlText w:val=""/>
-      <w:lvlJc w:val="left"/>
-      <w:pPr>
-        <w:tabs>
-          <w:tab w:val="num" w:pos="5672"/>
-        </w:tabs>
-        <w:ind w:left="5672" w:hanging="283"/>
-      </w:pPr>
-      <w:rPr>
-        <w:rFonts w:ascii="Symbol" w:hAnsi="Symbol" w:cs="Symbol" w:hint="default"/>
-      </w:rPr>
-    </w:lvl>
-    <w:lvl w:ilvl="8">
-      <w:start w:val="1"/>
-      <w:numFmt w:val="bullet"/>
-      <w:lvlText w:val=""/>
-      <w:lvlJc w:val="left"/>
-      <w:pPr>
-        <w:tabs>
-          <w:tab w:val="num" w:pos="6381"/>
-        </w:tabs>
-        <w:ind w:left="6381" w:hanging="283"/>
-      </w:pPr>
-      <w:rPr>
-        <w:rFonts w:ascii="Symbol" w:hAnsi="Symbol" w:cs="Symbol" w:hint="default"/>
-      </w:rPr>
-    </w:lvl>
-  </w:abstractNum>
-  <w:abstractNum w:abstractNumId="17">
     <w:lvl w:ilvl="0">
       <w:start w:val="1"/>
       <w:numFmt w:val="none"/>
@@ -4761,9 +4558,6 @@
   </w:num>
   <w:num w:numId="16">
     <w:abstractNumId w:val="16"/>
-  </w:num>
-  <w:num w:numId="17">
-    <w:abstractNumId w:val="17"/>
   </w:num>
 </w:numbering>
 </file>

</xml_diff>

<commit_message>
started writing the paper and added tex source of ieee and prepared first version
</commit_message>
<xml_diff>
--- a/drafts/paper_blueprint.docx
+++ b/drafts/paper_blueprint.docx
@@ -1157,15 +1157,7 @@
       </w:pPr>
       <w:r>
         <w:rPr/>
-        <w:t>4.</w:t>
-      </w:r>
-      <w:r>
-        <w:rPr/>
-        <w:t>2</w:t>
-      </w:r>
-      <w:r>
-        <w:rPr/>
-        <w:t xml:space="preserve"> Training Details</w:t>
+        <w:t>4.2 Training Details</w:t>
       </w:r>
     </w:p>
     <w:p>
@@ -1691,29 +1683,6 @@
       <w:r>
         <w:rPr/>
         <w:t xml:space="preserve">Larger Persian datasets </w:t>
-      </w:r>
-    </w:p>
-    <w:p>
-      <w:pPr>
-        <w:pStyle w:val="Normal"/>
-        <w:bidi w:val="0"/>
-        <w:jc w:val="left"/>
-        <w:rPr/>
-      </w:pPr>
-      <w:r>
-        <w:rPr/>
-        <w:t>Plots: PCA varience retention</w:t>
-      </w:r>
-    </w:p>
-    <w:p>
-      <w:pPr>
-        <w:pStyle w:val="Normal"/>
-        <w:bidi w:val="0"/>
-        <w:jc w:val="left"/>
-        <w:rPr/>
-      </w:pPr>
-      <w:r>
-        <w:rPr/>
       </w:r>
     </w:p>
     <w:p>
@@ -1729,597 +1698,8 @@
         </w:rPr>
       </w:pPr>
       <w:r>
-        <w:rPr>
-          <w:b/>
-          <w:bCs/>
-          <w:u w:val="single"/>
-        </w:rPr>
-        <w:t>Introduction</w:t>
-      </w:r>
-    </w:p>
-    <w:p>
-      <w:pPr>
-        <w:pStyle w:val="Normal"/>
-        <w:bidi w:val="0"/>
-        <w:jc w:val="left"/>
-        <w:rPr/>
-      </w:pPr>
-      <w:r>
-        <w:rPr/>
-        <w:t>(A Multimodal Approach for Persian Speech</w:t>
-      </w:r>
-    </w:p>
-    <w:p>
-      <w:pPr>
-        <w:pStyle w:val="Normal"/>
-        <w:bidi w:val="0"/>
-        <w:jc w:val="left"/>
-        <w:rPr/>
-      </w:pPr>
-      <w:r>
-        <w:rPr/>
-        <w:t>Emotion Recognition with Evolutionary Feature</w:t>
-      </w:r>
-    </w:p>
-    <w:p>
-      <w:pPr>
-        <w:pStyle w:val="Normal"/>
-        <w:bidi w:val="0"/>
-        <w:jc w:val="left"/>
-        <w:rPr/>
-      </w:pPr>
-      <w:r>
-        <w:rPr/>
-        <w:t>Selection)</w:t>
-        <w:br/>
-        <w:t>In recent years, emotion recognition from speech has</w:t>
-      </w:r>
-    </w:p>
-    <w:p>
-      <w:pPr>
-        <w:pStyle w:val="Normal"/>
-        <w:bidi w:val="0"/>
-        <w:jc w:val="left"/>
-        <w:rPr/>
-      </w:pPr>
-      <w:r>
-        <w:rPr/>
-        <w:t>become a challenging topic in the field of speech processing.</w:t>
-      </w:r>
-    </w:p>
-    <w:p>
-      <w:pPr>
-        <w:pStyle w:val="Normal"/>
-        <w:bidi w:val="0"/>
-        <w:jc w:val="left"/>
-        <w:rPr/>
-      </w:pPr>
-      <w:r>
-        <w:rPr/>
-        <w:t>Speech processing can be employed to extract valuable</w:t>
-      </w:r>
-    </w:p>
-    <w:p>
-      <w:pPr>
-        <w:pStyle w:val="Normal"/>
-        <w:bidi w:val="0"/>
-        <w:jc w:val="left"/>
-        <w:rPr/>
-      </w:pPr>
-      <w:r>
-        <w:rPr/>
-        <w:t>meanings, which significantly aids in improving emotion</w:t>
-      </w:r>
-    </w:p>
-    <w:p>
-      <w:pPr>
-        <w:pStyle w:val="Normal"/>
-        <w:bidi w:val="0"/>
-        <w:jc w:val="left"/>
-        <w:rPr/>
-      </w:pPr>
-      <w:r>
-        <w:rPr/>
-        <w:t>recognition systems [1, 2]. Additionally, this technology is</w:t>
-      </w:r>
-    </w:p>
-    <w:p>
-      <w:pPr>
-        <w:pStyle w:val="Normal"/>
-        <w:bidi w:val="0"/>
-        <w:jc w:val="left"/>
-        <w:rPr/>
-      </w:pPr>
-      <w:r>
-        <w:rPr/>
-        <w:t>highly effective for applications requiring natural human-</w:t>
-      </w:r>
-    </w:p>
-    <w:p>
-      <w:pPr>
-        <w:pStyle w:val="Normal"/>
-        <w:bidi w:val="0"/>
-        <w:jc w:val="left"/>
-        <w:rPr/>
-      </w:pPr>
-      <w:r>
-        <w:rPr/>
-        <w:t>machine interaction, such as voice assistants and educational</w:t>
-      </w:r>
-    </w:p>
-    <w:p>
-      <w:pPr>
-        <w:pStyle w:val="Normal"/>
-        <w:bidi w:val="0"/>
-        <w:jc w:val="left"/>
-        <w:rPr/>
-      </w:pPr>
-      <w:r>
-        <w:rPr/>
-        <w:t>programs. These systems can also be useful in identifying</w:t>
-      </w:r>
-    </w:p>
-    <w:p>
-      <w:pPr>
-        <w:pStyle w:val="Normal"/>
-        <w:bidi w:val="0"/>
-        <w:jc w:val="left"/>
-        <w:rPr/>
-      </w:pPr>
-      <w:r>
-        <w:rPr/>
-        <w:t>customer emotions in support call centers [3, 4] and serve as</w:t>
-      </w:r>
-    </w:p>
-    <w:p>
-      <w:pPr>
-        <w:pStyle w:val="Normal"/>
-        <w:bidi w:val="0"/>
-        <w:jc w:val="left"/>
-        <w:rPr/>
-      </w:pPr>
-      <w:r>
-        <w:rPr/>
-        <w:t>tools in the medical and psychological domains to detect</w:t>
-      </w:r>
-    </w:p>
-    <w:p>
-      <w:pPr>
-        <w:pStyle w:val="Normal"/>
-        <w:bidi w:val="0"/>
-        <w:jc w:val="left"/>
-        <w:rPr/>
-      </w:pPr>
-      <w:r>
-        <w:rPr/>
-        <w:t>certain diseases, such as heart conditions and cancers, as well</w:t>
-      </w:r>
-    </w:p>
-    <w:p>
-      <w:pPr>
-        <w:pStyle w:val="Normal"/>
-        <w:bidi w:val="0"/>
-        <w:jc w:val="left"/>
-        <w:rPr/>
-      </w:pPr>
-      <w:r>
-        <w:rPr/>
-        <w:t>as in recognizing emotions in physically disabled individuals.</w:t>
-      </w:r>
-    </w:p>
-    <w:p>
-      <w:pPr>
-        <w:pStyle w:val="Normal"/>
-        <w:bidi w:val="0"/>
-        <w:jc w:val="left"/>
-        <w:rPr/>
-      </w:pPr>
-      <w:r>
-        <w:rPr/>
-        <w:t>Over the years, advancements in speech processing and</w:t>
-      </w:r>
-    </w:p>
-    <w:p>
-      <w:pPr>
-        <w:pStyle w:val="Normal"/>
-        <w:bidi w:val="0"/>
-        <w:jc w:val="left"/>
-        <w:rPr/>
-      </w:pPr>
-      <w:r>
-        <w:rPr/>
-        <w:t>deep learning have significantly improved Speech Emotion</w:t>
-      </w:r>
-    </w:p>
-    <w:p>
-      <w:pPr>
-        <w:pStyle w:val="Normal"/>
-        <w:bidi w:val="0"/>
-        <w:jc w:val="left"/>
-        <w:rPr/>
-      </w:pPr>
-      <w:r>
-        <w:rPr/>
-        <w:t>Recognition (SER) performance. However, accurately</w:t>
-      </w:r>
-    </w:p>
-    <w:p>
-      <w:pPr>
-        <w:pStyle w:val="Normal"/>
-        <w:bidi w:val="0"/>
-        <w:jc w:val="left"/>
-        <w:rPr/>
-      </w:pPr>
-      <w:r>
-        <w:rPr/>
-        <w:t>recognizing emotions from speech remains a challenging task,</w:t>
-      </w:r>
-    </w:p>
-    <w:p>
-      <w:pPr>
-        <w:pStyle w:val="Normal"/>
-        <w:bidi w:val="0"/>
-        <w:jc w:val="left"/>
-        <w:rPr/>
-      </w:pPr>
-      <w:r>
-        <w:rPr/>
-        <w:t>particularly in low-resource languages like Persian, where</w:t>
-      </w:r>
-    </w:p>
-    <w:p>
-      <w:pPr>
-        <w:pStyle w:val="Normal"/>
-        <w:bidi w:val="0"/>
-        <w:jc w:val="left"/>
-        <w:rPr/>
-      </w:pPr>
-      <w:r>
-        <w:rPr/>
-        <w:t>limited labeled datasets, complex phonetic structures, and</w:t>
-      </w:r>
-    </w:p>
-    <w:p>
-      <w:pPr>
-        <w:pStyle w:val="Normal"/>
-        <w:bidi w:val="0"/>
-        <w:jc w:val="left"/>
-        <w:rPr/>
-      </w:pPr>
-      <w:r>
-        <w:rPr/>
-        <w:t>high linguistic variability introduce additional difficulties [9,</w:t>
-      </w:r>
-    </w:p>
-    <w:p>
-      <w:pPr>
-        <w:pStyle w:val="Normal"/>
-        <w:bidi w:val="0"/>
-        <w:jc w:val="left"/>
-        <w:rPr/>
-      </w:pPr>
-      <w:r>
-        <w:rPr/>
-        <w:t>10].</w:t>
-      </w:r>
-    </w:p>
-    <w:p>
-      <w:pPr>
-        <w:pStyle w:val="Normal"/>
-        <w:bidi w:val="0"/>
-        <w:jc w:val="left"/>
-        <w:rPr/>
-      </w:pPr>
-      <w:r>
-        <w:rPr/>
-        <w:t>Traditional acoustic-based SER models mainly rely on</w:t>
-      </w:r>
-    </w:p>
-    <w:p>
-      <w:pPr>
-        <w:pStyle w:val="Normal"/>
-        <w:bidi w:val="0"/>
-        <w:jc w:val="left"/>
-        <w:rPr/>
-      </w:pPr>
-      <w:r>
-        <w:rPr/>
-        <w:t>prosodic and spectral features, which may not fully capture</w:t>
-      </w:r>
-    </w:p>
-    <w:p>
-      <w:pPr>
-        <w:pStyle w:val="Normal"/>
-        <w:bidi w:val="0"/>
-        <w:jc w:val="left"/>
-        <w:rPr/>
-      </w:pPr>
-      <w:r>
-        <w:rPr/>
-        <w:t>emotional intent. Speech conveys emotions through intensity,</w:t>
-      </w:r>
-    </w:p>
-    <w:p>
-      <w:pPr>
-        <w:pStyle w:val="Normal"/>
-        <w:bidi w:val="0"/>
-        <w:jc w:val="left"/>
-        <w:rPr/>
-      </w:pPr>
-      <w:r>
-        <w:rPr/>
-        <w:t>temporal variations, voice quality, and spectral patterns, while</w:t>
-      </w:r>
-    </w:p>
-    <w:p>
-      <w:pPr>
-        <w:pStyle w:val="Normal"/>
-        <w:bidi w:val="0"/>
-        <w:jc w:val="left"/>
-        <w:rPr/>
-      </w:pPr>
-      <w:r>
-        <w:rPr/>
-        <w:t>semantic content also plays a crucial role. To improve</w:t>
-      </w:r>
-    </w:p>
-    <w:p>
-      <w:pPr>
-        <w:pStyle w:val="Normal"/>
-        <w:bidi w:val="0"/>
-        <w:jc w:val="left"/>
-        <w:rPr/>
-      </w:pPr>
-      <w:r>
-        <w:rPr/>
-        <w:t>accuracy, recent studies have explored multimodal</w:t>
-      </w:r>
-    </w:p>
-    <w:p>
-      <w:pPr>
-        <w:pStyle w:val="Normal"/>
-        <w:bidi w:val="0"/>
-        <w:jc w:val="left"/>
-        <w:rPr/>
-      </w:pPr>
-      <w:r>
-        <w:rPr/>
-        <w:t>approaches combining audio and text [1, 11, 12] .Text-based</w:t>
-      </w:r>
-    </w:p>
-    <w:p>
-      <w:pPr>
-        <w:pStyle w:val="Normal"/>
-        <w:bidi w:val="0"/>
-        <w:jc w:val="left"/>
-        <w:rPr/>
-      </w:pPr>
-      <w:r>
-        <w:rPr/>
-        <w:t>cues, extracted from spoken language transcription, provide</w:t>
-      </w:r>
-    </w:p>
-    <w:p>
-      <w:pPr>
-        <w:pStyle w:val="Normal"/>
-        <w:bidi w:val="0"/>
-        <w:jc w:val="left"/>
-        <w:rPr/>
-      </w:pPr>
-      <w:r>
-        <w:rPr/>
-        <w:t>additional semantic clarity, helping to distinguish ambiguous</w:t>
-      </w:r>
-    </w:p>
-    <w:p>
-      <w:pPr>
-        <w:pStyle w:val="Normal"/>
-        <w:bidi w:val="0"/>
-        <w:jc w:val="left"/>
-        <w:rPr/>
-      </w:pPr>
-      <w:r>
-        <w:rPr/>
-        <w:t>emotions [13, 14].</w:t>
-      </w:r>
-    </w:p>
-    <w:p>
-      <w:pPr>
-        <w:pStyle w:val="Normal"/>
-        <w:bidi w:val="0"/>
-        <w:jc w:val="left"/>
-        <w:rPr/>
-      </w:pPr>
-      <w:r>
-        <w:rPr/>
-      </w:r>
-    </w:p>
-    <w:p>
-      <w:pPr>
-        <w:pStyle w:val="Normal"/>
-        <w:bidi w:val="0"/>
-        <w:jc w:val="left"/>
-        <w:rPr>
-          <w:b/>
-          <w:b/>
-          <w:bCs/>
-          <w:u w:val="single"/>
-        </w:rPr>
-      </w:pPr>
-      <w:r>
-        <w:rPr>
-          <w:b/>
-          <w:bCs/>
-          <w:u w:val="single"/>
-        </w:rPr>
-        <w:t>ours</w:t>
-      </w:r>
-    </w:p>
-    <w:p>
-      <w:pPr>
-        <w:pStyle w:val="Normal"/>
-        <w:bidi w:val="0"/>
-        <w:jc w:val="left"/>
-        <w:rPr>
-          <w:b/>
-          <w:b/>
-          <w:bCs/>
-          <w:u w:val="single"/>
-        </w:rPr>
-      </w:pPr>
-      <w:r>
-        <w:rPr>
-          <w:b/>
-          <w:bCs/>
-          <w:u w:val="single"/>
-        </w:rPr>
-        <w:t>In recent studies, pre-trained models have been adapted for extracting features</w:t>
-      </w:r>
-    </w:p>
-    <w:p>
-      <w:pPr>
-        <w:pStyle w:val="Normal"/>
-        <w:bidi w:val="0"/>
-        <w:jc w:val="left"/>
-        <w:rPr>
-          <w:b/>
-          <w:b/>
-          <w:bCs/>
-          <w:u w:val="single"/>
-        </w:rPr>
-      </w:pPr>
-      <w:r>
-        <w:rPr>
-          <w:b/>
-          <w:bCs/>
-          <w:u w:val="single"/>
-        </w:rPr>
-        <w:t>as opposed to traditional features such as MFCC. These studies have achieved state-</w:t>
-      </w:r>
-    </w:p>
-    <w:p>
-      <w:pPr>
-        <w:pStyle w:val="Normal"/>
-        <w:bidi w:val="0"/>
-        <w:jc w:val="left"/>
-        <w:rPr>
-          <w:b/>
-          <w:b/>
-          <w:bCs/>
-          <w:u w:val="single"/>
-        </w:rPr>
-      </w:pPr>
-      <w:r>
-        <w:rPr>
-          <w:b/>
-          <w:bCs/>
-          <w:u w:val="single"/>
-        </w:rPr>
-        <w:t>of-the-art results by fine-tuning pre-trained models on an SER corpus. Some other</w:t>
-      </w:r>
-    </w:p>
-    <w:p>
-      <w:pPr>
-        <w:pStyle w:val="Normal"/>
-        <w:bidi w:val="0"/>
-        <w:jc w:val="left"/>
-        <w:rPr>
-          <w:b/>
-          <w:b/>
-          <w:bCs/>
-          <w:u w:val="single"/>
-        </w:rPr>
-      </w:pPr>
-      <w:r>
-        <w:rPr>
-          <w:b/>
-          <w:bCs/>
-          <w:u w:val="single"/>
-        </w:rPr>
-        <w:t>studies treat the pre-trained model as an upstream model for feature extraction by freezing all layers and building a downstream model for predicting emotions based on</w:t>
-      </w:r>
-    </w:p>
-    <w:p>
-      <w:pPr>
-        <w:pStyle w:val="Normal"/>
-        <w:bidi w:val="0"/>
-        <w:jc w:val="left"/>
-        <w:rPr>
-          <w:b/>
-          <w:b/>
-          <w:bCs/>
-          <w:u w:val="single"/>
-        </w:rPr>
-      </w:pPr>
-      <w:r>
-        <w:rPr>
-          <w:b/>
-          <w:bCs/>
-          <w:u w:val="single"/>
-        </w:rPr>
-        <w:t>the representations produced by the pre-trained model.</w:t>
-      </w:r>
-    </w:p>
-    <w:p>
-      <w:pPr>
-        <w:pStyle w:val="Normal"/>
-        <w:bidi w:val="0"/>
-        <w:jc w:val="left"/>
-        <w:rPr>
-          <w:b/>
-          <w:b/>
-          <w:bCs/>
-          <w:u w:val="single"/>
-        </w:rPr>
-      </w:pPr>
-      <w:r>
-        <w:rPr>
-          <w:b/>
-          <w:bCs/>
-          <w:u w:val="single"/>
-        </w:rPr>
-      </w:r>
-    </w:p>
-    <w:p>
-      <w:pPr>
-        <w:pStyle w:val="Normal"/>
-        <w:bidi w:val="0"/>
-        <w:jc w:val="left"/>
-        <w:rPr>
-          <w:b/>
-          <w:b/>
-          <w:bCs/>
-          <w:u w:val="single"/>
-        </w:rPr>
-      </w:pPr>
-      <w:r>
-        <w:rPr>
-          <w:b/>
-          <w:bCs/>
-          <w:u w:val="single"/>
-        </w:rPr>
-      </w:r>
-    </w:p>
-    <w:p>
-      <w:pPr>
-        <w:pStyle w:val="Normal"/>
-        <w:bidi w:val="0"/>
-        <w:jc w:val="left"/>
-        <w:rPr/>
-      </w:pPr>
-      <w:r>
-        <w:rPr/>
-      </w:r>
-    </w:p>
-    <w:p>
-      <w:pPr>
-        <w:pStyle w:val="Normal"/>
-        <w:bidi w:val="0"/>
-        <w:jc w:val="left"/>
-        <w:rPr/>
-      </w:pPr>
-      <w:r>
-        <w:rPr/>
+        <w:rPr/>
+        <w:t>Plots: PCA varience retention</w:t>
       </w:r>
     </w:p>
     <w:sectPr>

</xml_diff>